<commit_message>
Remove contract review labels
</commit_message>
<xml_diff>
--- a/docs/templates/ga-contracts/stonegate-ga-assignment-agreement.docx
+++ b/docs/templates/ga-contracts/stonegate-ga-assignment-agreement.docx
@@ -33,22 +33,6 @@
     </w:p>
     <w:p>
       <w:pPr>
-        <w:jc w:val="center"/>
-      </w:pPr>
-      <w:r>
-        <w:rPr>
-          <w:rFonts w:ascii="Arial" w:hAnsi="Arial" w:cs="Arial"/>
-          <w:sz w:val="28"/>
-          <w:sz-cs w:val="28"/>
-          <w:b/>
-          <w:spacing w:val="0"/>
-          <w:color w:val="7B1117"/>
-        </w:rPr>
-        <w:t xml:space="preserve">NOT ATTORNEY REVIEWED</w:t>
-      </w:r>
-    </w:p>
-    <w:p>
-      <w:pPr>
         <w:spacing w:after="120"/>
       </w:pPr>
       <w:r>
@@ -1346,7 +1330,7 @@
           <w:spacing w:val="0"/>
           <w:color w:val="49554C"/>
         </w:rPr>
-        <w:t xml:space="preserve">Stonegate Home Buyers | Georgia assignment agreement | Version 1 - 2026-07-26 | Not attorney reviewed</w:t>
+        <w:t xml:space="preserve">Stonegate Home Buyers | Georgia assignment agreement | Version 1 - 2026-07-26</w:t>
       </w:r>
     </w:p>
     <w:sectPr/>

</xml_diff>